<commit_message>
add: arch diag add: export pictures
</commit_message>
<xml_diff>
--- a/diplom.docx
+++ b/diplom.docx
@@ -5242,6 +5242,73 @@
           <w:lang w:val="en-US"/>
         </w:rPr>
       </w:pPr>
+      <w:r>
+        <w:rPr>
+          <w:noProof/>
+        </w:rPr>
+        <w:drawing>
+          <wp:anchor distT="0" distB="0" distL="114300" distR="114300" simplePos="0" relativeHeight="251666432" behindDoc="0" locked="0" layoutInCell="1" allowOverlap="1" wp14:anchorId="6538E9DD" wp14:editId="0DB0BA7E">
+            <wp:simplePos x="0" y="0"/>
+            <wp:positionH relativeFrom="margin">
+              <wp:posOffset>511810</wp:posOffset>
+            </wp:positionH>
+            <wp:positionV relativeFrom="paragraph">
+              <wp:posOffset>509270</wp:posOffset>
+            </wp:positionV>
+            <wp:extent cx="5598160" cy="2985135"/>
+            <wp:effectExtent l="0" t="0" r="2540" b="5715"/>
+            <wp:wrapTopAndBottom/>
+            <wp:docPr id="9" name="Рисунок 9"/>
+            <wp:cNvGraphicFramePr>
+              <a:graphicFrameLocks xmlns:a="http://schemas.openxmlformats.org/drawingml/2006/main" noChangeAspect="1"/>
+            </wp:cNvGraphicFramePr>
+            <a:graphic xmlns:a="http://schemas.openxmlformats.org/drawingml/2006/main">
+              <a:graphicData uri="http://schemas.openxmlformats.org/drawingml/2006/picture">
+                <pic:pic xmlns:pic="http://schemas.openxmlformats.org/drawingml/2006/picture">
+                  <pic:nvPicPr>
+                    <pic:cNvPr id="0" name="Picture 64"/>
+                    <pic:cNvPicPr>
+                      <a:picLocks noChangeAspect="1" noChangeArrowheads="1"/>
+                    </pic:cNvPicPr>
+                  </pic:nvPicPr>
+                  <pic:blipFill>
+                    <a:blip r:embed="rId8">
+                      <a:extLst>
+                        <a:ext uri="{28A0092B-C50C-407E-A947-70E740481C1C}">
+                          <a14:useLocalDpi xmlns:a14="http://schemas.microsoft.com/office/drawing/2010/main" val="0"/>
+                        </a:ext>
+                      </a:extLst>
+                    </a:blip>
+                    <a:srcRect/>
+                    <a:stretch>
+                      <a:fillRect/>
+                    </a:stretch>
+                  </pic:blipFill>
+                  <pic:spPr bwMode="auto">
+                    <a:xfrm>
+                      <a:off x="0" y="0"/>
+                      <a:ext cx="5598160" cy="2985135"/>
+                    </a:xfrm>
+                    <a:prstGeom prst="rect">
+                      <a:avLst/>
+                    </a:prstGeom>
+                    <a:noFill/>
+                    <a:ln>
+                      <a:noFill/>
+                    </a:ln>
+                  </pic:spPr>
+                </pic:pic>
+              </a:graphicData>
+            </a:graphic>
+            <wp14:sizeRelH relativeFrom="page">
+              <wp14:pctWidth>0</wp14:pctWidth>
+            </wp14:sizeRelH>
+            <wp14:sizeRelV relativeFrom="page">
+              <wp14:pctHeight>0</wp14:pctHeight>
+            </wp14:sizeRelV>
+          </wp:anchor>
+        </w:drawing>
+      </w:r>
     </w:p>
     <w:p>
       <w:pPr>
@@ -5287,6 +5354,73 @@
           <w:lang w:val="en-US"/>
         </w:rPr>
       </w:pPr>
+      <w:r>
+        <w:rPr>
+          <w:noProof/>
+        </w:rPr>
+        <w:drawing>
+          <wp:anchor distT="0" distB="0" distL="114300" distR="114300" simplePos="0" relativeHeight="251667456" behindDoc="0" locked="0" layoutInCell="1" allowOverlap="1" wp14:anchorId="0C2C7BE1" wp14:editId="16F60317">
+            <wp:simplePos x="0" y="0"/>
+            <wp:positionH relativeFrom="column">
+              <wp:posOffset>3195</wp:posOffset>
+            </wp:positionH>
+            <wp:positionV relativeFrom="paragraph">
+              <wp:posOffset>2601</wp:posOffset>
+            </wp:positionV>
+            <wp:extent cx="6156325" cy="2668270"/>
+            <wp:effectExtent l="0" t="0" r="0" b="0"/>
+            <wp:wrapTopAndBottom/>
+            <wp:docPr id="12" name="Рисунок 12"/>
+            <wp:cNvGraphicFramePr>
+              <a:graphicFrameLocks xmlns:a="http://schemas.openxmlformats.org/drawingml/2006/main" noChangeAspect="1"/>
+            </wp:cNvGraphicFramePr>
+            <a:graphic xmlns:a="http://schemas.openxmlformats.org/drawingml/2006/main">
+              <a:graphicData uri="http://schemas.openxmlformats.org/drawingml/2006/picture">
+                <pic:pic xmlns:pic="http://schemas.openxmlformats.org/drawingml/2006/picture">
+                  <pic:nvPicPr>
+                    <pic:cNvPr id="0" name="Picture 70"/>
+                    <pic:cNvPicPr>
+                      <a:picLocks noChangeAspect="1" noChangeArrowheads="1"/>
+                    </pic:cNvPicPr>
+                  </pic:nvPicPr>
+                  <pic:blipFill>
+                    <a:blip r:embed="rId9" cstate="print">
+                      <a:extLst>
+                        <a:ext uri="{28A0092B-C50C-407E-A947-70E740481C1C}">
+                          <a14:useLocalDpi xmlns:a14="http://schemas.microsoft.com/office/drawing/2010/main" val="0"/>
+                        </a:ext>
+                      </a:extLst>
+                    </a:blip>
+                    <a:srcRect/>
+                    <a:stretch>
+                      <a:fillRect/>
+                    </a:stretch>
+                  </pic:blipFill>
+                  <pic:spPr bwMode="auto">
+                    <a:xfrm>
+                      <a:off x="0" y="0"/>
+                      <a:ext cx="6156325" cy="2668270"/>
+                    </a:xfrm>
+                    <a:prstGeom prst="rect">
+                      <a:avLst/>
+                    </a:prstGeom>
+                    <a:noFill/>
+                    <a:ln>
+                      <a:noFill/>
+                    </a:ln>
+                  </pic:spPr>
+                </pic:pic>
+              </a:graphicData>
+            </a:graphic>
+            <wp14:sizeRelH relativeFrom="page">
+              <wp14:pctWidth>0</wp14:pctWidth>
+            </wp14:sizeRelH>
+            <wp14:sizeRelV relativeFrom="page">
+              <wp14:pctHeight>0</wp14:pctHeight>
+            </wp14:sizeRelV>
+          </wp:anchor>
+        </w:drawing>
+      </w:r>
     </w:p>
     <w:p>
       <w:pPr>
@@ -5401,6 +5535,7 @@
                 <w:sz w:val="28"/>
                 <w:szCs w:val="28"/>
               </w:rPr>
+              <w:lastRenderedPageBreak/>
               <w:t>Название</w:t>
             </w:r>
           </w:p>
@@ -6969,7 +7104,7 @@
         <w:tc>
           <w:tcPr>
             <w:tcW w:w="0" w:type="auto"/>
-            <w:shd w:val="clear" w:color="auto" w:fill="FF0000"/>
+            <w:shd w:val="clear" w:color="auto" w:fill="auto"/>
             <w:vAlign w:val="center"/>
             <w:hideMark/>
           </w:tcPr>
@@ -7001,7 +7136,7 @@
         <w:tc>
           <w:tcPr>
             <w:tcW w:w="0" w:type="auto"/>
-            <w:shd w:val="clear" w:color="auto" w:fill="FF0000"/>
+            <w:shd w:val="clear" w:color="auto" w:fill="auto"/>
             <w:vAlign w:val="center"/>
             <w:hideMark/>
           </w:tcPr>
@@ -7027,7 +7162,7 @@
         <w:tc>
           <w:tcPr>
             <w:tcW w:w="0" w:type="auto"/>
-            <w:shd w:val="clear" w:color="auto" w:fill="FF0000"/>
+            <w:shd w:val="clear" w:color="auto" w:fill="auto"/>
             <w:vAlign w:val="center"/>
             <w:hideMark/>
           </w:tcPr>
@@ -7059,7 +7194,7 @@
         <w:tc>
           <w:tcPr>
             <w:tcW w:w="0" w:type="auto"/>
-            <w:shd w:val="clear" w:color="auto" w:fill="FF0000"/>
+            <w:shd w:val="clear" w:color="auto" w:fill="auto"/>
             <w:vAlign w:val="center"/>
             <w:hideMark/>
           </w:tcPr>
@@ -7085,7 +7220,7 @@
         <w:tc>
           <w:tcPr>
             <w:tcW w:w="0" w:type="auto"/>
-            <w:shd w:val="clear" w:color="auto" w:fill="FF0000"/>
+            <w:shd w:val="clear" w:color="auto" w:fill="auto"/>
             <w:vAlign w:val="center"/>
             <w:hideMark/>
           </w:tcPr>
@@ -7930,7 +8065,6 @@
                 <w:sz w:val="28"/>
                 <w:szCs w:val="28"/>
               </w:rPr>
-              <w:lastRenderedPageBreak/>
               <w:t>description</w:t>
             </w:r>
             <w:proofErr w:type="spellEnd"/>
@@ -9597,6 +9731,7 @@
                 <w:sz w:val="28"/>
                 <w:szCs w:val="28"/>
               </w:rPr>
+              <w:lastRenderedPageBreak/>
               <w:t>voting_id</w:t>
             </w:r>
             <w:proofErr w:type="spellEnd"/>
@@ -11703,7 +11838,6 @@
                 <w:sz w:val="28"/>
                 <w:szCs w:val="28"/>
               </w:rPr>
-              <w:lastRenderedPageBreak/>
               <w:t>Поле</w:t>
             </w:r>
           </w:p>
@@ -13460,6 +13594,7 @@
                 <w:sz w:val="28"/>
                 <w:szCs w:val="28"/>
               </w:rPr>
+              <w:lastRenderedPageBreak/>
               <w:t>action_type</w:t>
             </w:r>
             <w:proofErr w:type="spellEnd"/>
@@ -16019,7 +16154,6 @@
                 <w:sz w:val="28"/>
                 <w:szCs w:val="28"/>
               </w:rPr>
-              <w:lastRenderedPageBreak/>
               <w:t>id</w:t>
             </w:r>
             <w:proofErr w:type="spellEnd"/>
@@ -16984,25 +17118,21 @@
       </w:tr>
     </w:tbl>
     <w:p>
-      <w:pPr>
-        <w:rPr>
-          <w:lang w:val="en-US"/>
-        </w:rPr>
-      </w:pPr>
       <w:r>
         <w:rPr>
           <w:noProof/>
         </w:rPr>
+        <w:lastRenderedPageBreak/>
         <w:drawing>
-          <wp:anchor distT="0" distB="0" distL="114300" distR="114300" simplePos="0" relativeHeight="251665408" behindDoc="0" locked="0" layoutInCell="1" allowOverlap="1" wp14:anchorId="5294BFE2" wp14:editId="45B3FBEB">
+          <wp:anchor distT="0" distB="0" distL="114300" distR="114300" simplePos="0" relativeHeight="251665408" behindDoc="0" locked="0" layoutInCell="1" allowOverlap="1" wp14:anchorId="5294BFE2" wp14:editId="096AC648">
             <wp:simplePos x="0" y="0"/>
             <wp:positionH relativeFrom="margin">
               <wp:align>left</wp:align>
             </wp:positionH>
             <wp:positionV relativeFrom="paragraph">
-              <wp:posOffset>203938</wp:posOffset>
+              <wp:posOffset>130075</wp:posOffset>
             </wp:positionV>
-            <wp:extent cx="6156325" cy="3970020"/>
+            <wp:extent cx="6214745" cy="4007485"/>
             <wp:effectExtent l="0" t="0" r="0" b="0"/>
             <wp:wrapTopAndBottom/>
             <wp:docPr id="7" name="Рисунок 7"/>
@@ -17019,7 +17149,7 @@
                     </pic:cNvPicPr>
                   </pic:nvPicPr>
                   <pic:blipFill>
-                    <a:blip r:embed="rId8" cstate="print">
+                    <a:blip r:embed="rId10" cstate="print">
                       <a:extLst>
                         <a:ext uri="{28A0092B-C50C-407E-A947-70E740481C1C}">
                           <a14:useLocalDpi xmlns:a14="http://schemas.microsoft.com/office/drawing/2010/main" val="0"/>
@@ -17034,7 +17164,7 @@
                   <pic:spPr bwMode="auto">
                     <a:xfrm>
                       <a:off x="0" y="0"/>
-                      <a:ext cx="6156325" cy="3970020"/>
+                      <a:ext cx="6214745" cy="4007485"/>
                     </a:xfrm>
                     <a:prstGeom prst="rect">
                       <a:avLst/>

</xml_diff>